<commit_message>
feat: rename Bug2JSON to BugSieve and show its 3B benchmark results
The project card, skill links, screenshot and resume now use BugSieve. The demo tabs are regenerated from the 3B model's benchmark run, keeping one real miss, and the trade-off note says the tuning used that benchmark.
</commit_message>
<xml_diff>
--- a/Divyajeet_Panda_Resume.docx
+++ b/Divyajeet_Panda_Resume.docx
@@ -765,7 +765,7 @@
           <w:color w:val="142D47"/>
           <w:sz w:val="20"/>
         </w:rPr>
-        <w:t>Bug2JSON: Bug Report Triage with a LoRA Fine-Tuning Pipeline</w:t>
+        <w:t>BugSieve: Bug Report Triage with a LoRA Fine-Tuning Pipeline</w:t>
       </w:r>
     </w:p>
     <w:p>
@@ -820,7 +820,7 @@
           <w:color w:val="1C1F23"/>
           <w:sz w:val="18"/>
         </w:rPr>
-        <w:t>Built a LoRA fine-tuning pipeline for Qwen2.5-1.5B-Instruct with prompt-loss masking and leakage-safe issue-group splits; no adapter has been trained yet.</w:t>
+        <w:t>Built a LoRA fine-tuning pipeline for Qwen2.5-3B-Instruct with prompt-loss masking and leakage-safe issue-group splits; no adapter has been trained yet.</w:t>
       </w:r>
     </w:p>
     <w:p>

</xml_diff>